<commit_message>
fix: aumenta fontes pequenas da ordem de sepultamento
</commit_message>
<xml_diff>
--- a/public/templates/official/sepultamento/ordem-sepultamento.docx
+++ b/public/templates/official/sepultamento/ordem-sepultamento.docx
@@ -552,7 +552,7 @@
                 <w:rFonts w:cs="Arial" w:ascii="Arial" w:hAnsi="Arial"/>
                 <w:b/>
                 <w:bCs/>
-                <w:sz w:val="15"/>
+                <w:sz w:val="18"/>
                 <w:lang w:val="pt-BR" w:bidi="ar-SA"/>
               </w:rPr>
               <w:t xml:space="preserve">           </w:t>
@@ -562,7 +562,7 @@
                 <w:rFonts w:cs="Arial" w:ascii="Arial" w:hAnsi="Arial"/>
                 <w:b/>
                 <w:bCs/>
-                <w:sz w:val="15"/>
+                <w:sz w:val="18"/>
                 <w:lang w:val="pt-BR" w:bidi="ar-SA"/>
               </w:rPr>
               <w:t>{{inscrGS}}</w:t>
@@ -616,7 +616,7 @@
                 <w:rFonts w:cs="Arial" w:ascii="Arial" w:hAnsi="Arial"/>
                 <w:b/>
                 <w:bCs/>
-                <w:sz w:val="15"/>
+                <w:sz w:val="18"/>
                 <w:lang w:val="pt-BR" w:bidi="ar-SA"/>
               </w:rPr>
               <w:t xml:space="preserve">                  </w:t>
@@ -626,7 +626,7 @@
                 <w:rFonts w:cs="Arial" w:ascii="Arial" w:hAnsi="Arial"/>
                 <w:b/>
                 <w:bCs/>
-                <w:sz w:val="15"/>
+                <w:sz w:val="18"/>
                 <w:lang w:val="pt-BR" w:bidi="ar-SA"/>
               </w:rPr>
               <w:t>{{numDO}}</w:t>
@@ -740,7 +740,7 @@
                 <w:rFonts w:cs="Calibri" w:ascii="Calibri" w:hAnsi="Calibri"/>
                 <w:b/>
                 <w:bCs/>
-                <w:sz w:val="15"/>
+                <w:sz w:val="18"/>
                 <w:szCs w:val="28"/>
                 <w:lang w:val="pt-BR" w:bidi="ar-SA"/>
               </w:rPr>
@@ -829,7 +829,7 @@
                 <w:b/>
                 <w:bCs/>
                 <w:color w:val="FF0000"/>
-                <w:sz w:val="15"/>
+                <w:sz w:val="18"/>
                 <w:szCs w:val="22"/>
                 <w:lang w:val="pt-BR" w:bidi="ar-SA"/>
               </w:rPr>
@@ -897,7 +897,7 @@
                 <w:rFonts w:cs="Arial" w:ascii="Arial" w:hAnsi="Arial"/>
                 <w:b/>
                 <w:bCs/>
-                <w:sz w:val="15"/>
+                <w:sz w:val="18"/>
                 <w:lang w:val="pt-BR" w:bidi="ar-SA"/>
               </w:rPr>
               <w:t xml:space="preserve">                         </w:t>
@@ -907,7 +907,7 @@
                 <w:rFonts w:cs="Arial" w:ascii="Arial" w:hAnsi="Arial"/>
                 <w:b/>
                 <w:bCs/>
-                <w:sz w:val="15"/>
+                <w:sz w:val="18"/>
                 <w:lang w:val="pt-BR" w:bidi="ar-SA"/>
               </w:rPr>
               <w:t>{{horaSep}}</w:t>
@@ -1309,7 +1309,7 @@
             <w:r>
               <w:rPr>
                 <w:rFonts w:cs="Arial" w:ascii="Arial" w:hAnsi="Arial"/>
-                <w:sz w:val="15"/>
+                <w:sz w:val="18"/>
                 <w:lang w:val="pt-BR" w:bidi="ar-SA"/>
               </w:rPr>
               <w:t xml:space="preserve">Na qualidade de {{parent}} autorizo o sepultamento junto à administração do Cemitério Santana, nesta data. </w:t>
@@ -1995,7 +1995,7 @@
             <w:r>
               <w:rPr>
                 <w:rFonts w:cs="Arial" w:ascii="Arial" w:hAnsi="Arial"/>
-                <w:sz w:val="15"/>
+                <w:sz w:val="18"/>
                 <w:szCs w:val="18"/>
                 <w:lang w:val="pt-BR" w:bidi="ar-SA"/>
               </w:rPr>
@@ -2004,7 +2004,7 @@
             <w:r>
               <w:rPr>
                 <w:rFonts w:cs="Arial" w:ascii="Arial" w:hAnsi="Arial"/>
-                <w:sz w:val="15"/>
+                <w:sz w:val="18"/>
                 <w:szCs w:val="18"/>
                 <w:lang w:val="pt-BR" w:bidi="ar-SA"/>
               </w:rPr>
@@ -2117,7 +2117,7 @@
             <w:r>
               <w:rPr>
                 <w:rFonts w:cs="Arial" w:ascii="Arial" w:hAnsi="Arial"/>
-                <w:sz w:val="15"/>
+                <w:sz w:val="18"/>
                 <w:szCs w:val="18"/>
                 <w:lang w:val="pt-BR" w:bidi="ar-SA"/>
               </w:rPr>
@@ -2126,7 +2126,7 @@
             <w:r>
               <w:rPr>
                 <w:rFonts w:cs="Arial" w:ascii="Arial" w:hAnsi="Arial"/>
-                <w:sz w:val="15"/>
+                <w:sz w:val="18"/>
                 <w:szCs w:val="18"/>
                 <w:lang w:val="pt-BR" w:bidi="ar-SA"/>
               </w:rPr>
@@ -2511,32 +2511,10 @@
                 <w:rFonts w:ascii="Arial" w:hAnsi="Arial" w:cs="Arial"/>
                 <w:b/>
                 <w:bCs/>
-                <w:sz w:val="16"/>
-                <w:szCs w:val="16"/>
-              </w:rPr>
-            </w:pPr>
-            <w:r>
-              <w:rPr>
-                <w:rFonts w:cs="Arial" w:ascii="Arial" w:hAnsi="Arial"/>
-                <w:b/>
-                <w:bCs/>
                 <w:sz w:val="18"/>
                 <w:szCs w:val="18"/>
-                <w:lang w:val="pt-BR" w:bidi="ar-SA"/>
-              </w:rPr>
-              <w:t xml:space="preserve">L:  {{livroObito}} </w:t>
-            </w:r>
-            <w:r>
-              <w:rPr>
-                <w:rFonts w:cs="Arial" w:ascii="Arial" w:hAnsi="Arial"/>
-                <w:b/>
-                <w:bCs/>
-                <w:sz w:val="16"/>
-                <w:szCs w:val="16"/>
-                <w:lang w:val="pt-BR" w:bidi="ar-SA"/>
-              </w:rPr>
-              <w:t xml:space="preserve">                        </w:t>
-            </w:r>
+              </w:rPr>
+            </w:pPr>
             <w:r>
               <w:rPr>
                 <w:rFonts w:cs="Arial" w:ascii="Arial" w:hAnsi="Arial"/>
@@ -2546,22 +2524,8 @@
                 <w:szCs w:val="18"/>
                 <w:lang w:val="pt-BR" w:bidi="ar-SA"/>
               </w:rPr>
-              <w:t xml:space="preserve">L: </w:t>
-            </w:r>
-          </w:p>
-          <w:p>
-            <w:pPr>
-              <w:pStyle w:val="Normal"/>
-              <w:widowControl/>
-              <w:suppressAutoHyphens w:val="true"/>
-              <w:spacing w:before="0" w:after="0"/>
-              <w:jc w:val="start"/>
-              <w:rPr>
-                <w:rFonts w:ascii="Arial" w:hAnsi="Arial" w:cs="Arial"/>
-                <w:b/>
-                <w:bCs/>
-              </w:rPr>
-            </w:pPr>
+              <w:t xml:space="preserve">L:  {{livroObito}} </w:t>
+            </w:r>
             <w:r>
               <w:rPr>
                 <w:rFonts w:cs="Arial" w:ascii="Arial" w:hAnsi="Arial"/>
@@ -2571,6 +2535,42 @@
                 <w:szCs w:val="18"/>
                 <w:lang w:val="pt-BR" w:bidi="ar-SA"/>
               </w:rPr>
+              <w:t xml:space="preserve">                        </w:t>
+            </w:r>
+            <w:r>
+              <w:rPr>
+                <w:rFonts w:cs="Arial" w:ascii="Arial" w:hAnsi="Arial"/>
+                <w:b/>
+                <w:bCs/>
+                <w:sz w:val="18"/>
+                <w:szCs w:val="18"/>
+                <w:lang w:val="pt-BR" w:bidi="ar-SA"/>
+              </w:rPr>
+              <w:t xml:space="preserve">L: </w:t>
+            </w:r>
+          </w:p>
+          <w:p>
+            <w:pPr>
+              <w:pStyle w:val="Normal"/>
+              <w:widowControl/>
+              <w:suppressAutoHyphens w:val="true"/>
+              <w:spacing w:before="0" w:after="0"/>
+              <w:jc w:val="start"/>
+              <w:rPr>
+                <w:rFonts w:ascii="Arial" w:hAnsi="Arial" w:cs="Arial"/>
+                <w:b/>
+                <w:bCs/>
+              </w:rPr>
+            </w:pPr>
+            <w:r>
+              <w:rPr>
+                <w:rFonts w:cs="Arial" w:ascii="Arial" w:hAnsi="Arial"/>
+                <w:b/>
+                <w:bCs/>
+                <w:sz w:val="18"/>
+                <w:szCs w:val="18"/>
+                <w:lang w:val="pt-BR" w:bidi="ar-SA"/>
+              </w:rPr>
               <w:t>F:</w:t>
             </w:r>
             <w:r>
@@ -2578,8 +2578,8 @@
                 <w:rFonts w:cs="Arial" w:ascii="Arial" w:hAnsi="Arial"/>
                 <w:b/>
                 <w:bCs/>
-                <w:sz w:val="16"/>
-                <w:szCs w:val="16"/>
+                <w:sz w:val="18"/>
+                <w:szCs w:val="18"/>
                 <w:lang w:val="pt-BR" w:bidi="ar-SA"/>
               </w:rPr>
               <w:t xml:space="preserve">                                </w:t>
@@ -2669,15 +2669,15 @@
               <w:jc w:val="center"/>
               <w:rPr>
                 <w:rFonts w:ascii="Arial" w:hAnsi="Arial" w:cs="Arial"/>
-                <w:sz w:val="2"/>
-                <w:szCs w:val="2"/>
-              </w:rPr>
-            </w:pPr>
-            <w:r>
-              <w:rPr>
-                <w:rFonts w:cs="Arial" w:ascii="Arial" w:hAnsi="Arial"/>
-                <w:sz w:val="2"/>
-                <w:szCs w:val="2"/>
+                <w:sz w:val="18"/>
+                <w:szCs w:val="18"/>
+              </w:rPr>
+            </w:pPr>
+            <w:r>
+              <w:rPr>
+                <w:rFonts w:cs="Arial" w:ascii="Arial" w:hAnsi="Arial"/>
+                <w:sz w:val="18"/>
+                <w:szCs w:val="18"/>
               </w:rPr>
             </w:r>
           </w:p>
@@ -2759,15 +2759,15 @@
               <w:jc w:val="center"/>
               <w:rPr>
                 <w:rFonts w:ascii="Arial" w:hAnsi="Arial" w:cs="Arial"/>
-                <w:sz w:val="2"/>
-                <w:szCs w:val="2"/>
-              </w:rPr>
-            </w:pPr>
-            <w:r>
-              <w:rPr>
-                <w:rFonts w:cs="Arial" w:ascii="Arial" w:hAnsi="Arial"/>
-                <w:sz w:val="2"/>
-                <w:szCs w:val="2"/>
+                <w:sz w:val="18"/>
+                <w:szCs w:val="18"/>
+              </w:rPr>
+            </w:pPr>
+            <w:r>
+              <w:rPr>
+                <w:rFonts w:cs="Arial" w:ascii="Arial" w:hAnsi="Arial"/>
+                <w:sz w:val="18"/>
+                <w:szCs w:val="18"/>
               </w:rPr>
             </w:r>
           </w:p>

</xml_diff>